<commit_message>
Add prompt template for post-handoff client-fork copy to DTSweb
Documents the safe way to publish this codebase to the client-facing
DTSweb repo once /migrate-handoff is done on the client's own accounts.
Names the two leaks found by checking the repo directly -- raw /data
still carrying real gated tourUrl/embedUrl values, and js/config.js
carrying all 16 real Treedis tour URLs -- so a future session excludes
them instead of doing a naive folder or git copy.
</commit_message>
<xml_diff>
--- a/Wrapper/map/dts/dts3/docs/DTS-Documentation-Guide.docx
+++ b/Wrapper/map/dts/dts3/docs/DTS-Documentation-Guide.docx
@@ -4854,6 +4854,663 @@
     </w:p>
     <w:p>
       <w:pPr>
+        <w:pStyle w:val="Heading2"/>
+      </w:pPr>
+      <w:r>
+        <w:t>K. Publishing a scrubbed client-fork copy (post-handoff)</w:t>
+      </w:r>
+    </w:p>
+    <w:p>
+      <w:pPr/>
+      <w:r>
+        <w:t>Use only once /migrate-handoff is actually done on the client's own accounts. The naive version of this — a raw folder or git copy — was checked directly in this project and found to leak every gated Treedis tour URL plus internal migration history.</w:t>
+      </w:r>
+    </w:p>
+    <w:p>
+      <w:pPr>
+        <w:keepNext/>
+        <w:spacing w:after="40" w:before="160"/>
+      </w:pPr>
+      <w:pPr/>
+      <w:r>
+        <w:rPr>
+          <w:b/>
+          <w:sz w:val="18"/>
+        </w:rPr>
+        <w:t>PROMPT</w:t>
+      </w:r>
+    </w:p>
+    <w:p>
+      <w:pPr>
+        <w:spacing w:before="80" w:after="0" w:line="254" w:lineRule="auto"/>
+        <w:ind w:left="173" w:right="86"/>
+        <w:shd w:val="clear" w:color="auto" w:fill="F2F4F7"/>
+        <w:pBdr>
+          <w:left w:val="single" w:sz="6" w:space="6" w:color="C8CDD6"/>
+          <w:right w:val="single" w:sz="6" w:space="6" w:color="C8CDD6"/>
+          <w:top w:val="single" w:sz="6" w:space="6" w:color="C8CDD6"/>
+        </w:pBdr>
+      </w:pPr>
+      <w:pPr/>
+      <w:r>
+        <w:rPr>
+          <w:rFonts w:ascii="Consolas" w:hAnsi="Consolas"/>
+          <w:sz w:val="18"/>
+        </w:rPr>
+        <w:t>Read CLAUDE.md and docs/WEBSITE-STATE.md §9–§10 first, then</w:t>
+      </w:r>
+    </w:p>
+    <w:p>
+      <w:pPr>
+        <w:spacing w:before="0" w:after="0" w:line="254" w:lineRule="auto"/>
+        <w:ind w:left="173" w:right="86"/>
+        <w:shd w:val="clear" w:color="auto" w:fill="F2F4F7"/>
+        <w:pBdr>
+          <w:left w:val="single" w:sz="6" w:space="6" w:color="C8CDD6"/>
+          <w:right w:val="single" w:sz="6" w:space="6" w:color="C8CDD6"/>
+        </w:pBdr>
+      </w:pPr>
+      <w:pPr/>
+      <w:r>
+        <w:rPr>
+          <w:rFonts w:ascii="Consolas" w:hAnsi="Consolas"/>
+          <w:sz w:val="18"/>
+        </w:rPr>
+        <w:t>docs/migration/ACCOUNT-SETUP-AND-HANDOFF.md. Confirm /migrate-handoff</w:t>
+      </w:r>
+    </w:p>
+    <w:p>
+      <w:pPr>
+        <w:spacing w:before="0" w:after="0" w:line="254" w:lineRule="auto"/>
+        <w:ind w:left="173" w:right="86"/>
+        <w:shd w:val="clear" w:color="auto" w:fill="F2F4F7"/>
+        <w:pBdr>
+          <w:left w:val="single" w:sz="6" w:space="6" w:color="C8CDD6"/>
+          <w:right w:val="single" w:sz="6" w:space="6" w:color="C8CDD6"/>
+        </w:pBdr>
+      </w:pPr>
+      <w:pPr/>
+      <w:r>
+        <w:rPr>
+          <w:rFonts w:ascii="Consolas" w:hAnsi="Consolas"/>
+          <w:sz w:val="18"/>
+        </w:rPr>
+        <w:t>has actually completed — the site must be running on the CLIENT's</w:t>
+      </w:r>
+    </w:p>
+    <w:p>
+      <w:pPr>
+        <w:spacing w:before="0" w:after="0" w:line="254" w:lineRule="auto"/>
+        <w:ind w:left="173" w:right="86"/>
+        <w:shd w:val="clear" w:color="auto" w:fill="F2F4F7"/>
+        <w:pBdr>
+          <w:left w:val="single" w:sz="6" w:space="6" w:color="C8CDD6"/>
+          <w:right w:val="single" w:sz="6" w:space="6" w:color="C8CDD6"/>
+        </w:pBdr>
+      </w:pPr>
+      <w:pPr/>
+      <w:r>
+        <w:rPr>
+          <w:rFonts w:ascii="Consolas" w:hAnsi="Consolas"/>
+          <w:sz w:val="18"/>
+        </w:rPr>
+        <w:t>own Cloudflare and Supabase accounts, not mine, before this prompt is</w:t>
+      </w:r>
+    </w:p>
+    <w:p>
+      <w:pPr>
+        <w:spacing w:before="0" w:after="0" w:line="254" w:lineRule="auto"/>
+        <w:ind w:left="173" w:right="86"/>
+        <w:shd w:val="clear" w:color="auto" w:fill="F2F4F7"/>
+        <w:pBdr>
+          <w:left w:val="single" w:sz="6" w:space="6" w:color="C8CDD6"/>
+          <w:right w:val="single" w:sz="6" w:space="6" w:color="C8CDD6"/>
+        </w:pBdr>
+      </w:pPr>
+      <w:pPr/>
+      <w:r>
+        <w:rPr>
+          <w:rFonts w:ascii="Consolas" w:hAnsi="Consolas"/>
+          <w:sz w:val="18"/>
+        </w:rPr>
+        <w:t>used at all.</w:t>
+      </w:r>
+    </w:p>
+    <w:p>
+      <w:pPr>
+        <w:spacing w:before="0" w:after="0" w:line="254" w:lineRule="auto"/>
+        <w:ind w:left="173" w:right="86"/>
+        <w:shd w:val="clear" w:color="auto" w:fill="F2F4F7"/>
+        <w:pBdr>
+          <w:left w:val="single" w:sz="6" w:space="6" w:color="C8CDD6"/>
+          <w:right w:val="single" w:sz="6" w:space="6" w:color="C8CDD6"/>
+        </w:pBdr>
+      </w:pPr>
+      <w:pPr/>
+      <w:r>
+        <w:rPr>
+          <w:rFonts w:ascii="Consolas" w:hAnsi="Consolas"/>
+          <w:sz w:val="18"/>
+        </w:rPr>
+        <w:t xml:space="preserve"> </w:t>
+      </w:r>
+    </w:p>
+    <w:p>
+      <w:pPr>
+        <w:spacing w:before="0" w:after="0" w:line="254" w:lineRule="auto"/>
+        <w:ind w:left="173" w:right="86"/>
+        <w:shd w:val="clear" w:color="auto" w:fill="F2F4F7"/>
+        <w:pBdr>
+          <w:left w:val="single" w:sz="6" w:space="6" w:color="C8CDD6"/>
+          <w:right w:val="single" w:sz="6" w:space="6" w:color="C8CDD6"/>
+        </w:pBdr>
+      </w:pPr>
+      <w:pPr/>
+      <w:r>
+        <w:rPr>
+          <w:rFonts w:ascii="Consolas" w:hAnsi="Consolas"/>
+          <w:sz w:val="18"/>
+        </w:rPr>
+        <w:t>I want to publish the current working code to E:\DTSweb so the</w:t>
+      </w:r>
+    </w:p>
+    <w:p>
+      <w:pPr>
+        <w:spacing w:before="0" w:after="0" w:line="254" w:lineRule="auto"/>
+        <w:ind w:left="173" w:right="86"/>
+        <w:shd w:val="clear" w:color="auto" w:fill="F2F4F7"/>
+        <w:pBdr>
+          <w:left w:val="single" w:sz="6" w:space="6" w:color="C8CDD6"/>
+          <w:right w:val="single" w:sz="6" w:space="6" w:color="C8CDD6"/>
+        </w:pBdr>
+      </w:pPr>
+      <w:pPr/>
+      <w:r>
+        <w:rPr>
+          <w:rFonts w:ascii="Consolas" w:hAnsi="Consolas"/>
+          <w:sz w:val="18"/>
+        </w:rPr>
+        <w:t>client can fork it. This is NOT a raw folder or git copy. Checked</w:t>
+      </w:r>
+    </w:p>
+    <w:p>
+      <w:pPr>
+        <w:spacing w:before="0" w:after="0" w:line="254" w:lineRule="auto"/>
+        <w:ind w:left="173" w:right="86"/>
+        <w:shd w:val="clear" w:color="auto" w:fill="F2F4F7"/>
+        <w:pBdr>
+          <w:left w:val="single" w:sz="6" w:space="6" w:color="C8CDD6"/>
+          <w:right w:val="single" w:sz="6" w:space="6" w:color="C8CDD6"/>
+        </w:pBdr>
+      </w:pPr>
+      <w:pPr/>
+      <w:r>
+        <w:rPr>
+          <w:rFonts w:ascii="Consolas" w:hAnsi="Consolas"/>
+          <w:sz w:val="18"/>
+        </w:rPr>
+        <w:t>directly once already: dts3's own /data is raw and unsplit — real</w:t>
+      </w:r>
+    </w:p>
+    <w:p>
+      <w:pPr>
+        <w:spacing w:before="0" w:after="0" w:line="254" w:lineRule="auto"/>
+        <w:ind w:left="173" w:right="86"/>
+        <w:shd w:val="clear" w:color="auto" w:fill="F2F4F7"/>
+        <w:pBdr>
+          <w:left w:val="single" w:sz="6" w:space="6" w:color="C8CDD6"/>
+          <w:right w:val="single" w:sz="6" w:space="6" w:color="C8CDD6"/>
+        </w:pBdr>
+      </w:pPr>
+      <w:pPr/>
+      <w:r>
+        <w:rPr>
+          <w:rFonts w:ascii="Consolas" w:hAnsi="Consolas"/>
+          <w:sz w:val="18"/>
+        </w:rPr>
+        <w:t>gated tourUrl/embedUrl values sit right next to their access level</w:t>
+      </w:r>
+    </w:p>
+    <w:p>
+      <w:pPr>
+        <w:spacing w:before="0" w:after="0" w:line="254" w:lineRule="auto"/>
+        <w:ind w:left="173" w:right="86"/>
+        <w:shd w:val="clear" w:color="auto" w:fill="F2F4F7"/>
+        <w:pBdr>
+          <w:left w:val="single" w:sz="6" w:space="6" w:color="C8CDD6"/>
+          <w:right w:val="single" w:sz="6" w:space="6" w:color="C8CDD6"/>
+        </w:pBdr>
+      </w:pPr>
+      <w:pPr/>
+      <w:r>
+        <w:rPr>
+          <w:rFonts w:ascii="Consolas" w:hAnsi="Consolas"/>
+          <w:sz w:val="18"/>
+        </w:rPr>
+        <w:t>(e.g. gfc.json), and js/config.js carries all 16 real Treedis tour</w:t>
+      </w:r>
+    </w:p>
+    <w:p>
+      <w:pPr>
+        <w:spacing w:before="0" w:after="0" w:line="254" w:lineRule="auto"/>
+        <w:ind w:left="173" w:right="86"/>
+        <w:shd w:val="clear" w:color="auto" w:fill="F2F4F7"/>
+        <w:pBdr>
+          <w:left w:val="single" w:sz="6" w:space="6" w:color="C8CDD6"/>
+          <w:right w:val="single" w:sz="6" w:space="6" w:color="C8CDD6"/>
+        </w:pBdr>
+      </w:pPr>
+      <w:pPr/>
+      <w:r>
+        <w:rPr>
+          <w:rFonts w:ascii="Consolas" w:hAnsi="Consolas"/>
+          <w:sz w:val="18"/>
+        </w:rPr>
+        <w:t>URLs in the clear. Both must be excluded from whatever ships to</w:t>
+      </w:r>
+    </w:p>
+    <w:p>
+      <w:pPr>
+        <w:spacing w:before="0" w:after="0" w:line="254" w:lineRule="auto"/>
+        <w:ind w:left="173" w:right="86"/>
+        <w:shd w:val="clear" w:color="auto" w:fill="F2F4F7"/>
+        <w:pBdr>
+          <w:left w:val="single" w:sz="6" w:space="6" w:color="C8CDD6"/>
+          <w:right w:val="single" w:sz="6" w:space="6" w:color="C8CDD6"/>
+        </w:pBdr>
+      </w:pPr>
+      <w:pPr/>
+      <w:r>
+        <w:rPr>
+          <w:rFonts w:ascii="Consolas" w:hAnsi="Consolas"/>
+          <w:sz w:val="18"/>
+        </w:rPr>
+        <w:t>DTSweb.</w:t>
+      </w:r>
+    </w:p>
+    <w:p>
+      <w:pPr>
+        <w:spacing w:before="0" w:after="0" w:line="254" w:lineRule="auto"/>
+        <w:ind w:left="173" w:right="86"/>
+        <w:shd w:val="clear" w:color="auto" w:fill="F2F4F7"/>
+        <w:pBdr>
+          <w:left w:val="single" w:sz="6" w:space="6" w:color="C8CDD6"/>
+          <w:right w:val="single" w:sz="6" w:space="6" w:color="C8CDD6"/>
+        </w:pBdr>
+      </w:pPr>
+      <w:pPr/>
+      <w:r>
+        <w:rPr>
+          <w:rFonts w:ascii="Consolas" w:hAnsi="Consolas"/>
+          <w:sz w:val="18"/>
+        </w:rPr>
+        <w:t xml:space="preserve"> </w:t>
+      </w:r>
+    </w:p>
+    <w:p>
+      <w:pPr>
+        <w:spacing w:before="0" w:after="0" w:line="254" w:lineRule="auto"/>
+        <w:ind w:left="173" w:right="86"/>
+        <w:shd w:val="clear" w:color="auto" w:fill="F2F4F7"/>
+        <w:pBdr>
+          <w:left w:val="single" w:sz="6" w:space="6" w:color="C8CDD6"/>
+          <w:right w:val="single" w:sz="6" w:space="6" w:color="C8CDD6"/>
+        </w:pBdr>
+      </w:pPr>
+      <w:pPr/>
+      <w:r>
+        <w:rPr>
+          <w:rFonts w:ascii="Consolas" w:hAnsi="Consolas"/>
+          <w:sz w:val="18"/>
+        </w:rPr>
+        <w:t>Before copying anything, confirm and show me:</w:t>
+      </w:r>
+    </w:p>
+    <w:p>
+      <w:pPr>
+        <w:spacing w:before="0" w:after="0" w:line="254" w:lineRule="auto"/>
+        <w:ind w:left="173" w:right="86"/>
+        <w:shd w:val="clear" w:color="auto" w:fill="F2F4F7"/>
+        <w:pBdr>
+          <w:left w:val="single" w:sz="6" w:space="6" w:color="C8CDD6"/>
+          <w:right w:val="single" w:sz="6" w:space="6" w:color="C8CDD6"/>
+        </w:pBdr>
+      </w:pPr>
+      <w:pPr/>
+      <w:r>
+        <w:rPr>
+          <w:rFonts w:ascii="Consolas" w:hAnsi="Consolas"/>
+          <w:sz w:val="18"/>
+        </w:rPr>
+        <w:t xml:space="preserve">  - handoff is actually done, not just planned</w:t>
+      </w:r>
+    </w:p>
+    <w:p>
+      <w:pPr>
+        <w:spacing w:before="0" w:after="0" w:line="254" w:lineRule="auto"/>
+        <w:ind w:left="173" w:right="86"/>
+        <w:shd w:val="clear" w:color="auto" w:fill="F2F4F7"/>
+        <w:pBdr>
+          <w:left w:val="single" w:sz="6" w:space="6" w:color="C8CDD6"/>
+          <w:right w:val="single" w:sz="6" w:space="6" w:color="C8CDD6"/>
+        </w:pBdr>
+      </w:pPr>
+      <w:pPr/>
+      <w:r>
+        <w:rPr>
+          <w:rFonts w:ascii="Consolas" w:hAnsi="Consolas"/>
+          <w:sz w:val="18"/>
+        </w:rPr>
+        <w:t xml:space="preserve">  - the copy is a fresh working-tree snapshot, NOT dts3's .git</w:t>
+      </w:r>
+    </w:p>
+    <w:p>
+      <w:pPr>
+        <w:spacing w:before="0" w:after="0" w:line="254" w:lineRule="auto"/>
+        <w:ind w:left="173" w:right="86"/>
+        <w:shd w:val="clear" w:color="auto" w:fill="F2F4F7"/>
+        <w:pBdr>
+          <w:left w:val="single" w:sz="6" w:space="6" w:color="C8CDD6"/>
+          <w:right w:val="single" w:sz="6" w:space="6" w:color="C8CDD6"/>
+        </w:pBdr>
+      </w:pPr>
+      <w:pPr/>
+      <w:r>
+        <w:rPr>
+          <w:rFonts w:ascii="Consolas" w:hAnsi="Consolas"/>
+          <w:sz w:val="18"/>
+        </w:rPr>
+        <w:t xml:space="preserve">    history — this repo's history has already held real values</w:t>
+      </w:r>
+    </w:p>
+    <w:p>
+      <w:pPr>
+        <w:spacing w:before="0" w:after="0" w:line="254" w:lineRule="auto"/>
+        <w:ind w:left="173" w:right="86"/>
+        <w:shd w:val="clear" w:color="auto" w:fill="F2F4F7"/>
+        <w:pBdr>
+          <w:left w:val="single" w:sz="6" w:space="6" w:color="C8CDD6"/>
+          <w:right w:val="single" w:sz="6" w:space="6" w:color="C8CDD6"/>
+        </w:pBdr>
+      </w:pPr>
+      <w:pPr/>
+      <w:r>
+        <w:rPr>
+          <w:rFonts w:ascii="Consolas" w:hAnsi="Consolas"/>
+          <w:sz w:val="18"/>
+        </w:rPr>
+        <w:t xml:space="preserve">    that were later removed in a follow-up commit rather than</w:t>
+      </w:r>
+    </w:p>
+    <w:p>
+      <w:pPr>
+        <w:spacing w:before="0" w:after="0" w:line="254" w:lineRule="auto"/>
+        <w:ind w:left="173" w:right="86"/>
+        <w:shd w:val="clear" w:color="auto" w:fill="F2F4F7"/>
+        <w:pBdr>
+          <w:left w:val="single" w:sz="6" w:space="6" w:color="C8CDD6"/>
+          <w:right w:val="single" w:sz="6" w:space="6" w:color="C8CDD6"/>
+        </w:pBdr>
+      </w:pPr>
+      <w:pPr/>
+      <w:r>
+        <w:rPr>
+          <w:rFonts w:ascii="Consolas" w:hAnsi="Consolas"/>
+          <w:sz w:val="18"/>
+        </w:rPr>
+        <w:t xml:space="preserve">    rewritten out</w:t>
+      </w:r>
+    </w:p>
+    <w:p>
+      <w:pPr>
+        <w:spacing w:before="0" w:after="0" w:line="254" w:lineRule="auto"/>
+        <w:ind w:left="173" w:right="86"/>
+        <w:shd w:val="clear" w:color="auto" w:fill="F2F4F7"/>
+        <w:pBdr>
+          <w:left w:val="single" w:sz="6" w:space="6" w:color="C8CDD6"/>
+          <w:right w:val="single" w:sz="6" w:space="6" w:color="C8CDD6"/>
+        </w:pBdr>
+      </w:pPr>
+      <w:pPr/>
+      <w:r>
+        <w:rPr>
+          <w:rFonts w:ascii="Consolas" w:hAnsi="Consolas"/>
+          <w:sz w:val="18"/>
+        </w:rPr>
+        <w:t xml:space="preserve">  - what's excluded: .env*, docs/migration/* (internal session log</w:t>
+      </w:r>
+    </w:p>
+    <w:p>
+      <w:pPr>
+        <w:spacing w:before="0" w:after="0" w:line="254" w:lineRule="auto"/>
+        <w:ind w:left="173" w:right="86"/>
+        <w:shd w:val="clear" w:color="auto" w:fill="F2F4F7"/>
+        <w:pBdr>
+          <w:left w:val="single" w:sz="6" w:space="6" w:color="C8CDD6"/>
+          <w:right w:val="single" w:sz="6" w:space="6" w:color="C8CDD6"/>
+        </w:pBdr>
+      </w:pPr>
+      <w:pPr/>
+      <w:r>
+        <w:rPr>
+          <w:rFonts w:ascii="Consolas" w:hAnsi="Consolas"/>
+          <w:sz w:val="18"/>
+        </w:rPr>
+        <w:t xml:space="preserve">    and account setup notes), scripts/ unless the client's own team</w:t>
+      </w:r>
+    </w:p>
+    <w:p>
+      <w:pPr>
+        <w:spacing w:before="0" w:after="0" w:line="254" w:lineRule="auto"/>
+        <w:ind w:left="173" w:right="86"/>
+        <w:shd w:val="clear" w:color="auto" w:fill="F2F4F7"/>
+        <w:pBdr>
+          <w:left w:val="single" w:sz="6" w:space="6" w:color="C8CDD6"/>
+          <w:right w:val="single" w:sz="6" w:space="6" w:color="C8CDD6"/>
+        </w:pBdr>
+      </w:pPr>
+      <w:pPr/>
+      <w:r>
+        <w:rPr>
+          <w:rFonts w:ascii="Consolas" w:hAnsi="Consolas"/>
+          <w:sz w:val="18"/>
+        </w:rPr>
+        <w:t xml:space="preserve">    wants the CLI tooling, and the raw js/config.js</w:t>
+      </w:r>
+    </w:p>
+    <w:p>
+      <w:pPr>
+        <w:spacing w:before="0" w:after="0" w:line="254" w:lineRule="auto"/>
+        <w:ind w:left="173" w:right="86"/>
+        <w:shd w:val="clear" w:color="auto" w:fill="F2F4F7"/>
+        <w:pBdr>
+          <w:left w:val="single" w:sz="6" w:space="6" w:color="C8CDD6"/>
+          <w:right w:val="single" w:sz="6" w:space="6" w:color="C8CDD6"/>
+        </w:pBdr>
+      </w:pPr>
+      <w:pPr/>
+      <w:r>
+        <w:rPr>
+          <w:rFonts w:ascii="Consolas" w:hAnsi="Consolas"/>
+          <w:sz w:val="18"/>
+        </w:rPr>
+        <w:t xml:space="preserve">  - js/config.js is overlaid with a stripped copy the same way</w:t>
+      </w:r>
+    </w:p>
+    <w:p>
+      <w:pPr>
+        <w:spacing w:before="0" w:after="0" w:line="254" w:lineRule="auto"/>
+        <w:ind w:left="173" w:right="86"/>
+        <w:shd w:val="clear" w:color="auto" w:fill="F2F4F7"/>
+        <w:pBdr>
+          <w:left w:val="single" w:sz="6" w:space="6" w:color="C8CDD6"/>
+          <w:right w:val="single" w:sz="6" w:space="6" w:color="C8CDD6"/>
+        </w:pBdr>
+      </w:pPr>
+      <w:pPr/>
+      <w:r>
+        <w:rPr>
+          <w:rFonts w:ascii="Consolas" w:hAnsi="Consolas"/>
+          <w:sz w:val="18"/>
+        </w:rPr>
+        <w:t xml:space="preserve">    docs/migration/DEPLOY-STAGING.md does for deploys</w:t>
+      </w:r>
+    </w:p>
+    <w:p>
+      <w:pPr>
+        <w:spacing w:before="0" w:after="0" w:line="254" w:lineRule="auto"/>
+        <w:ind w:left="173" w:right="86"/>
+        <w:shd w:val="clear" w:color="auto" w:fill="F2F4F7"/>
+        <w:pBdr>
+          <w:left w:val="single" w:sz="6" w:space="6" w:color="C8CDD6"/>
+          <w:right w:val="single" w:sz="6" w:space="6" w:color="C8CDD6"/>
+        </w:pBdr>
+      </w:pPr>
+      <w:pPr/>
+      <w:r>
+        <w:rPr>
+          <w:rFonts w:ascii="Consolas" w:hAnsi="Consolas"/>
+          <w:sz w:val="18"/>
+        </w:rPr>
+        <w:t xml:space="preserve">  - /data ships as the real current/source split (see</w:t>
+      </w:r>
+    </w:p>
+    <w:p>
+      <w:pPr>
+        <w:spacing w:before="0" w:after="0" w:line="254" w:lineRule="auto"/>
+        <w:ind w:left="173" w:right="86"/>
+        <w:shd w:val="clear" w:color="auto" w:fill="F2F4F7"/>
+        <w:pBdr>
+          <w:left w:val="single" w:sz="6" w:space="6" w:color="C8CDD6"/>
+          <w:right w:val="single" w:sz="6" w:space="6" w:color="C8CDD6"/>
+        </w:pBdr>
+      </w:pPr>
+      <w:pPr/>
+      <w:r>
+        <w:rPr>
+          <w:rFonts w:ascii="Consolas" w:hAnsi="Consolas"/>
+          <w:sz w:val="18"/>
+        </w:rPr>
+        <w:t xml:space="preserve">    functions/_lib/split-logic.js), never the raw dev copy</w:t>
+      </w:r>
+    </w:p>
+    <w:p>
+      <w:pPr>
+        <w:spacing w:before="0" w:after="0" w:line="254" w:lineRule="auto"/>
+        <w:ind w:left="173" w:right="86"/>
+        <w:shd w:val="clear" w:color="auto" w:fill="F2F4F7"/>
+        <w:pBdr>
+          <w:left w:val="single" w:sz="6" w:space="6" w:color="C8CDD6"/>
+          <w:right w:val="single" w:sz="6" w:space="6" w:color="C8CDD6"/>
+        </w:pBdr>
+      </w:pPr>
+      <w:pPr/>
+      <w:r>
+        <w:rPr>
+          <w:rFonts w:ascii="Consolas" w:hAnsi="Consolas"/>
+          <w:sz w:val="18"/>
+        </w:rPr>
+        <w:t xml:space="preserve">  - nothing copied still references my personal Cloudflare/Supabase</w:t>
+      </w:r>
+    </w:p>
+    <w:p>
+      <w:pPr>
+        <w:spacing w:before="0" w:after="0" w:line="254" w:lineRule="auto"/>
+        <w:ind w:left="173" w:right="86"/>
+        <w:shd w:val="clear" w:color="auto" w:fill="F2F4F7"/>
+        <w:pBdr>
+          <w:left w:val="single" w:sz="6" w:space="6" w:color="C8CDD6"/>
+          <w:right w:val="single" w:sz="6" w:space="6" w:color="C8CDD6"/>
+        </w:pBdr>
+      </w:pPr>
+      <w:pPr/>
+      <w:r>
+        <w:rPr>
+          <w:rFonts w:ascii="Consolas" w:hAnsi="Consolas"/>
+          <w:sz w:val="18"/>
+        </w:rPr>
+        <w:t xml:space="preserve">    project IDs, emails, or the seeded dummy test accounts</w:t>
+      </w:r>
+    </w:p>
+    <w:p>
+      <w:pPr>
+        <w:spacing w:before="0" w:after="0" w:line="254" w:lineRule="auto"/>
+        <w:ind w:left="173" w:right="86"/>
+        <w:shd w:val="clear" w:color="auto" w:fill="F2F4F7"/>
+        <w:pBdr>
+          <w:left w:val="single" w:sz="6" w:space="6" w:color="C8CDD6"/>
+          <w:right w:val="single" w:sz="6" w:space="6" w:color="C8CDD6"/>
+        </w:pBdr>
+      </w:pPr>
+      <w:pPr/>
+      <w:r>
+        <w:rPr>
+          <w:rFonts w:ascii="Consolas" w:hAnsi="Consolas"/>
+          <w:sz w:val="18"/>
+        </w:rPr>
+        <w:t xml:space="preserve"> </w:t>
+      </w:r>
+    </w:p>
+    <w:p>
+      <w:pPr>
+        <w:spacing w:before="0" w:after="0" w:line="254" w:lineRule="auto"/>
+        <w:ind w:left="173" w:right="86"/>
+        <w:shd w:val="clear" w:color="auto" w:fill="F2F4F7"/>
+        <w:pBdr>
+          <w:left w:val="single" w:sz="6" w:space="6" w:color="C8CDD6"/>
+          <w:right w:val="single" w:sz="6" w:space="6" w:color="C8CDD6"/>
+        </w:pBdr>
+      </w:pPr>
+      <w:pPr/>
+      <w:r>
+        <w:rPr>
+          <w:rFonts w:ascii="Consolas" w:hAnsi="Consolas"/>
+          <w:sz w:val="18"/>
+        </w:rPr>
+        <w:t>Show me the exact file list — included and excluded, and why —</w:t>
+      </w:r>
+    </w:p>
+    <w:p>
+      <w:pPr>
+        <w:spacing w:before="0" w:after="0" w:line="254" w:lineRule="auto"/>
+        <w:ind w:left="173" w:right="86"/>
+        <w:shd w:val="clear" w:color="auto" w:fill="F2F4F7"/>
+        <w:pBdr>
+          <w:left w:val="single" w:sz="6" w:space="6" w:color="C8CDD6"/>
+          <w:right w:val="single" w:sz="6" w:space="6" w:color="C8CDD6"/>
+        </w:pBdr>
+      </w:pPr>
+      <w:pPr/>
+      <w:r>
+        <w:rPr>
+          <w:rFonts w:ascii="Consolas" w:hAnsi="Consolas"/>
+          <w:sz w:val="18"/>
+        </w:rPr>
+        <w:t>before writing anything to E:\DTSweb. Don't push to its remote</w:t>
+      </w:r>
+    </w:p>
+    <w:p>
+      <w:pPr>
+        <w:spacing w:before="0" w:after="180" w:line="254" w:lineRule="auto"/>
+        <w:ind w:left="173" w:right="86"/>
+        <w:shd w:val="clear" w:color="auto" w:fill="F2F4F7"/>
+        <w:pBdr>
+          <w:left w:val="single" w:sz="6" w:space="6" w:color="C8CDD6"/>
+          <w:right w:val="single" w:sz="6" w:space="6" w:color="C8CDD6"/>
+          <w:bottom w:val="single" w:sz="6" w:space="6" w:color="C8CDD6"/>
+        </w:pBdr>
+      </w:pPr>
+      <w:pPr/>
+      <w:r>
+        <w:rPr>
+          <w:rFonts w:ascii="Consolas" w:hAnsi="Consolas"/>
+          <w:sz w:val="18"/>
+        </w:rPr>
+        <w:t>until I say so.</w:t>
+      </w:r>
+    </w:p>
+    <w:p>
+      <w:pPr>
         <w:pStyle w:val="Heading1"/>
       </w:pPr>
       <w:r>

</xml_diff>